<commit_message>
Remove interdepartmental coordination bullet from experience
Drops the last bullet under Grupo Médico Delihealths that named
specific internal company areas (HR, Operaciones, Contabilidad,
Legal, Supply), in both the digital CV and the Word CV.

Co-Authored-By: Claude Sonnet 5 <noreply@anthropic.com>
Claude-Session: https://claude.ai/code/session_01SV1CWvbAU92Xqs4bKMHW8P
</commit_message>
<xml_diff>
--- a/CV_Ingrid_Castillo_Perez.docx
+++ b/CV_Ingrid_Castillo_Perez.docx
@@ -313,25 +313,6 @@
           <w:szCs w:val="19"/>
         </w:rPr>
         <w:t xml:space="preserve">Análisis, seguimiento y mejora de procesos: Creación y mantenimiento de formularios, tableros, controles y reportes para seguimiento de incidencias, equipos, accesos y operación; identificación de discrepancias y riesgos relacionados con inventarios y cumplimiento de procesos.</w:t>
-      </w:r>
-    </w:p>
-    <w:p>
-      <w:pPr>
-        <w:pStyle w:val="ListParagraph"/>
-        <w:numPr>
-          <w:ilvl w:val="0"/>
-          <w:numId w:val="2"/>
-        </w:numPr>
-        <w:spacing w:after="65"/>
-      </w:pPr>
-      <w:r>
-        <w:rPr>
-          <w:rFonts w:ascii="Calibri" w:cs="Calibri" w:eastAsia="Calibri" w:hAnsi="Calibri"/>
-          <w:color w:val="222222"/>
-          <w:sz w:val="19"/>
-          <w:szCs w:val="19"/>
-        </w:rPr>
-        <w:t xml:space="preserve">Coordinación interdepartamental: Comunicación y seguimiento con Recursos Humanos, Operaciones, Contabilidad, Legal, Supply y usuarios finales para resolución de requerimientos tecnológicos y ejecución de procesos internos.</w:t>
       </w:r>
     </w:p>
     <w:p>

</xml_diff>

<commit_message>
Add reworded interdepartmental coordination bullet
Re-adds a bullet to Grupo Médico Delihealths describing cross-team
coordination without naming specific internal company areas, with
its lead-in phrase bold, matching the other bullets. Applied to both
the digital CV and the Word CV.

Co-Authored-By: Claude Sonnet 5 <noreply@anthropic.com>
Claude-Session: https://claude.ai/code/session_01SV1CWvbAU92Xqs4bKMHW8P
</commit_message>
<xml_diff>
--- a/CV_Ingrid_Castillo_Perez.docx
+++ b/CV_Ingrid_Castillo_Perez.docx
@@ -313,6 +313,36 @@
           <w:szCs w:val="19"/>
         </w:rPr>
         <w:t xml:space="preserve">Análisis, seguimiento y mejora de procesos: Creación y mantenimiento de formularios, tableros, controles y reportes para seguimiento de incidencias, equipos, accesos y operación; identificación de discrepancias y riesgos relacionados con inventarios y cumplimiento de procesos.</w:t>
+      </w:r>
+    </w:p>
+    <w:p>
+      <w:pPr>
+        <w:pStyle w:val="ListParagraph"/>
+        <w:numPr>
+          <w:ilvl w:val="0"/>
+          <w:numId w:val="2"/>
+        </w:numPr>
+        <w:spacing w:after="65"/>
+      </w:pPr>
+      <w:r>
+        <w:rPr>
+          <w:rFonts w:ascii="Calibri" w:cs="Calibri" w:eastAsia="Calibri" w:hAnsi="Calibri"/>
+          <w:b/>
+          <w:bCs/>
+          <w:color w:val="222222"/>
+          <w:sz w:val="19"/>
+          <w:szCs w:val="19"/>
+        </w:rPr>
+        <w:t xml:space="preserve">Coordinación y seguimiento interdepartamental: </w:t>
+      </w:r>
+      <w:r>
+        <w:rPr>
+          <w:rFonts w:ascii="Calibri" w:cs="Calibri" w:eastAsia="Calibri" w:hAnsi="Calibri"/>
+          <w:color w:val="222222"/>
+          <w:sz w:val="19"/>
+          <w:szCs w:val="19"/>
+        </w:rPr>
+        <w:t xml:space="preserve">Comunicación con distintos equipos, responsables y usuarios para atender requerimientos tecnológicos, dar seguimiento a incidencias y asegurar la correcta ejecución de procesos internos.</w:t>
       </w:r>
     </w:p>
     <w:p>

</xml_diff>

<commit_message>
Update header: new title, simplified location, contact on the right, add LinkedIn
Replaces "Ing. Comunicaciones y Electrónica" with "IT Support
Specialist | Operación de TI | Gestión de Activos y Accesos",
shortens the address to just CDMX, and adds a LinkedIn link.

In the digital CV, restructures the header so contact info (location,
phone, email, LinkedIn) sits on the right side while the photo/name/
title stay on the left; on narrow screens it stacks below. The Word
CV keeps its centered header but gets the same content updates, with
LinkedIn as a clickable hyperlink.

Co-Authored-By: Claude Sonnet 5 <noreply@anthropic.com>
Claude-Session: https://claude.ai/code/session_01SV1CWvbAU92Xqs4bKMHW8P
</commit_message>
<xml_diff>
--- a/CV_Ingrid_Castillo_Perez.docx
+++ b/CV_Ingrid_Castillo_Perez.docx
@@ -29,9 +29,9 @@
         <w:rPr>
           <w:rFonts w:ascii="Calibri" w:cs="Calibri" w:eastAsia="Calibri" w:hAnsi="Calibri"/>
           <w:color w:val="5C4033"/>
-          <w:spacing w:val="20"/>
-        </w:rPr>
-        <w:t xml:space="preserve">ING. COMUNICACIONES Y ELECTRÓNICA</w:t>
+          <w:spacing w:val="10"/>
+        </w:rPr>
+        <w:t xml:space="preserve">IT Support Specialist | Operación de TI | Gestión de Activos y Accesos</w:t>
       </w:r>
     </w:p>
     <w:p>
@@ -49,8 +49,20 @@
           <w:sz w:val="18"/>
           <w:szCs w:val="18"/>
         </w:rPr>
-        <w:t xml:space="preserve">Guerrero, Cuauhtémoc, 06300, CDMX   |   5591920047   |   ipcp1101@outlook.com</w:t>
-      </w:r>
+        <w:t xml:space="preserve">CDMX   |   5591920047   |   ipcp1101@outlook.com   |   </w:t>
+      </w:r>
+      <w:hyperlink w:history="1" r:id="rIdvrxuhosqpl6m_jplqngcp">
+        <w:r>
+          <w:rPr>
+            <w:rFonts w:ascii="Calibri" w:cs="Calibri" w:eastAsia="Calibri" w:hAnsi="Calibri"/>
+            <w:color w:val="5A5A5A"/>
+            <w:sz w:val="18"/>
+            <w:szCs w:val="18"/>
+            <w:u w:val="single"/>
+          </w:rPr>
+          <w:t xml:space="preserve">LinkedIn</w:t>
+        </w:r>
+      </w:hyperlink>
     </w:p>
     <w:p>
       <w:pPr>

</xml_diff>

<commit_message>
Redesign CV as recruiter-first single page
- Replace tabs with a single scrolling page, sticky section nav and scrollspy
- Hero with availability badge and contact column on the right (email,
  WhatsApp, phone, LinkedIn, CV download)
- KPI strip, key-areas keywords, experience timeline with duration,
  sector, tools and "ver más" for secondary responsibilities
- Grouped skills, education with titulación status, certifications
  grouped by issuer with verification badges (inline previews kept)
- Accessibility, print styles and Open Graph meta for link previews
- Update docx: availability, WhatsApp, titulación status, typo fixes
- Add project agent cv-talento-ux (RH talent + UI/UX reviewer)

Co-Authored-By: Claude Opus 5.5 <noreply@anthropic.com>
</commit_message>
<xml_diff>
--- a/CV_Ingrid_Castillo_Perez.docx
+++ b/CV_Ingrid_Castillo_Perez.docx
@@ -49,7 +49,7 @@
           <w:sz w:val="18"/>
           <w:szCs w:val="18"/>
         </w:rPr>
-        <w:t xml:space="preserve">CDMX   |   5591920047   |   ipcp1101@outlook.com   |   </w:t>
+        <w:t xml:space="preserve">CDMX   |   Disponibilidad inmediata   |   55 9192 0047 (WhatsApp)   |   ipcp1101@outlook.com   |   </w:t>
       </w:r>
       <w:hyperlink w:history="1" r:id="rIdpdfl56btk4fmfkz_e6unv">
         <w:r>
@@ -631,7 +631,7 @@
           <w:sz w:val="21"/>
           <w:szCs w:val="21"/>
         </w:rPr>
-        <w:t xml:space="preserve">International Youth Fundation, CECATI 162</w:t>
+        <w:t xml:space="preserve">International Youth Foundation, CECATI 162</w:t>
       </w:r>
       <w:r>
         <w:rPr>
@@ -689,7 +689,7 @@
           <w:sz w:val="19"/>
           <w:szCs w:val="19"/>
         </w:rPr>
-        <w:t xml:space="preserve">Los bites y bytes de las redes informáticas (Abril, 2021)</w:t>
+        <w:t xml:space="preserve">Los bits y bytes de las redes informáticas (Abril, 2021)</w:t>
       </w:r>
     </w:p>
     <w:p>
@@ -850,7 +850,7 @@
           <w:sz w:val="19"/>
           <w:szCs w:val="19"/>
         </w:rPr>
-        <w:t xml:space="preserve">Escuela Superior de Ingeniería Mecánica y Eléctrica, Unidad Culhuacan, Instituto Politécnico Nacional</w:t>
+        <w:t xml:space="preserve">Escuela Superior de Ingeniería Mecánica y Eléctrica, Unidad Culhuacán, Instituto Politécnico Nacional. Pasante: servicio social concluido, titulación en trámite.</w:t>
       </w:r>
     </w:p>
     <w:p>

</xml_diff>

<commit_message>
Highlight key recruiter data in CV
- Add marker-style highlight to 22 key phrases on the web CV
  (tools, scope, figures, core tasks); kept visible when printing
- Bold the same phrases in the docx for ATS-friendly emphasis

Co-Authored-By: Claude Opus 5.5 <noreply@anthropic.com>
</commit_message>
<xml_diff>
--- a/CV_Ingrid_Castillo_Perez.docx
+++ b/CV_Ingrid_Castillo_Perez.docx
@@ -94,7 +94,71 @@
           <w:rFonts w:ascii="Calibri" w:cs="Calibri" w:eastAsia="Calibri" w:hAnsi="Calibri"/>
           <w:color w:val="222222"/>
         </w:rPr>
-        <w:t xml:space="preserve">Cuento con experiencia en soporte y operación de TI, brindando atención a usuarios y soluciones a incidencias de hardware, software y plataformas corporativas. A lo largo de mi experiencia he desarrollado habilidades para administrar equipos, accesos y activos tecnológicos, así como para documentar y dar seguimiento a distintos requerimientos. Me caracterizo por ser organizada, analítica y resolutiva, con facilidad para adaptarme, aprender nuevas herramientas y contribuir a la mejora de los procesos tecnológicos.</w:t>
+        <w:t xml:space="preserve">Cuento con experiencia en </w:t>
+      </w:r>
+      <w:r>
+        <w:rPr>
+          <w:rFonts w:ascii="Calibri" w:cs="Calibri" w:eastAsia="Calibri" w:hAnsi="Calibri"/>
+          <w:color w:val="222222"/>
+          <w:b/>
+          <w:bCs/>
+        </w:rPr>
+        <w:t xml:space="preserve">soporte y operación de TI</w:t>
+      </w:r>
+      <w:r>
+        <w:rPr>
+          <w:rFonts w:ascii="Calibri" w:cs="Calibri" w:eastAsia="Calibri" w:hAnsi="Calibri"/>
+          <w:color w:val="222222"/>
+        </w:rPr>
+        <w:t xml:space="preserve">, brindando atención a usuarios y soluciones a </w:t>
+      </w:r>
+      <w:r>
+        <w:rPr>
+          <w:rFonts w:ascii="Calibri" w:cs="Calibri" w:eastAsia="Calibri" w:hAnsi="Calibri"/>
+          <w:color w:val="222222"/>
+          <w:b/>
+          <w:bCs/>
+        </w:rPr>
+        <w:t xml:space="preserve">incidencias de hardware, software y plataformas corporativas</w:t>
+      </w:r>
+      <w:r>
+        <w:rPr>
+          <w:rFonts w:ascii="Calibri" w:cs="Calibri" w:eastAsia="Calibri" w:hAnsi="Calibri"/>
+          <w:color w:val="222222"/>
+        </w:rPr>
+        <w:t xml:space="preserve">. A lo largo de mi experiencia he desarrollado habilidades para </w:t>
+      </w:r>
+      <w:r>
+        <w:rPr>
+          <w:rFonts w:ascii="Calibri" w:cs="Calibri" w:eastAsia="Calibri" w:hAnsi="Calibri"/>
+          <w:color w:val="222222"/>
+          <w:b/>
+          <w:bCs/>
+        </w:rPr>
+        <w:t xml:space="preserve">administrar equipos, accesos y activos tecnológicos</w:t>
+      </w:r>
+      <w:r>
+        <w:rPr>
+          <w:rFonts w:ascii="Calibri" w:cs="Calibri" w:eastAsia="Calibri" w:hAnsi="Calibri"/>
+          <w:color w:val="222222"/>
+        </w:rPr>
+        <w:t xml:space="preserve">, así como para documentar y dar seguimiento a distintos requerimientos. Me caracterizo por ser </w:t>
+      </w:r>
+      <w:r>
+        <w:rPr>
+          <w:rFonts w:ascii="Calibri" w:cs="Calibri" w:eastAsia="Calibri" w:hAnsi="Calibri"/>
+          <w:color w:val="222222"/>
+          <w:b/>
+          <w:bCs/>
+        </w:rPr>
+        <w:t xml:space="preserve">organizada, analítica y resolutiva</w:t>
+      </w:r>
+      <w:r>
+        <w:rPr>
+          <w:rFonts w:ascii="Calibri" w:cs="Calibri" w:eastAsia="Calibri" w:hAnsi="Calibri"/>
+          <w:color w:val="222222"/>
+        </w:rPr>
+        <w:t xml:space="preserve">, con facilidad para adaptarme, aprender nuevas herramientas y contribuir a la mejora de los procesos tecnológicos.</w:t>
       </w:r>
     </w:p>
     <w:p>
@@ -172,159 +236,439 @@
           <w:sz w:val="19"/>
           <w:szCs w:val="19"/>
         </w:rPr>
-        <w:t xml:space="preserve">Soporte técnico y gestión de incidencias: Atención, diagnóstico, seguimiento y resolución de incidencias de hardware, software, Microsoft 365, conectividad, periféricos y plataformas corporativas para usuarios y sedes remotas.</w:t>
-      </w:r>
-    </w:p>
-    <w:p>
-      <w:pPr>
-        <w:pStyle w:val="ListParagraph"/>
-        <w:numPr>
-          <w:ilvl w:val="0"/>
-          <w:numId w:val="2"/>
-        </w:numPr>
-        <w:spacing w:after="65"/>
-      </w:pPr>
-      <w:r>
-        <w:rPr>
-          <w:rFonts w:ascii="Calibri" w:cs="Calibri" w:eastAsia="Calibri" w:hAnsi="Calibri"/>
-          <w:color w:val="222222"/>
-          <w:sz w:val="19"/>
-          <w:szCs w:val="19"/>
-        </w:rPr>
-        <w:t xml:space="preserve">Administración de equipos e inventario tecnológico: Gestión del ciclo de vida de equipos de cómputo y dispositivos móviles, incluyendo asignaciones, altas, bajas, resguardos, inventarios, validación física y funcional, movimientos entre sedes y recuperación de activos.</w:t>
-      </w:r>
-    </w:p>
-    <w:p>
-      <w:pPr>
-        <w:pStyle w:val="ListParagraph"/>
-        <w:numPr>
-          <w:ilvl w:val="0"/>
-          <w:numId w:val="2"/>
-        </w:numPr>
-        <w:spacing w:after="65"/>
-      </w:pPr>
-      <w:r>
-        <w:rPr>
-          <w:rFonts w:ascii="Calibri" w:cs="Calibri" w:eastAsia="Calibri" w:hAnsi="Calibri"/>
-          <w:color w:val="222222"/>
-          <w:sz w:val="19"/>
-          <w:szCs w:val="19"/>
-        </w:rPr>
-        <w:t xml:space="preserve">Administración de usuarios, accesos y permisos: Creación, modificación y baja de cuentas; administración de permisos, credenciales, accesos a plataformas internas y soporte a procesos de autenticación y recuperación de cuentas.</w:t>
-      </w:r>
-    </w:p>
-    <w:p>
-      <w:pPr>
-        <w:pStyle w:val="ListParagraph"/>
-        <w:numPr>
-          <w:ilvl w:val="0"/>
-          <w:numId w:val="2"/>
-        </w:numPr>
-        <w:spacing w:after="65"/>
-      </w:pPr>
-      <w:r>
-        <w:rPr>
-          <w:rFonts w:ascii="Calibri" w:cs="Calibri" w:eastAsia="Calibri" w:hAnsi="Calibri"/>
-          <w:color w:val="222222"/>
-          <w:sz w:val="19"/>
-          <w:szCs w:val="19"/>
-        </w:rPr>
-        <w:t xml:space="preserve">Onboarding y offboarding tecnológico: Preparación y entrega de equipos, configuración de accesos y herramientas para nuevos ingresos, así como revocación de accesos, recuperación de activos y cierre tecnológico en procesos de baja.</w:t>
-      </w:r>
-    </w:p>
-    <w:p>
-      <w:pPr>
-        <w:pStyle w:val="ListParagraph"/>
-        <w:numPr>
-          <w:ilvl w:val="0"/>
-          <w:numId w:val="2"/>
-        </w:numPr>
-        <w:spacing w:after="65"/>
-      </w:pPr>
-      <w:r>
-        <w:rPr>
-          <w:rFonts w:ascii="Calibri" w:cs="Calibri" w:eastAsia="Calibri" w:hAnsi="Calibri"/>
-          <w:color w:val="222222"/>
-          <w:sz w:val="19"/>
-          <w:szCs w:val="19"/>
-        </w:rPr>
-        <w:t xml:space="preserve">Administración y soporte de plataformas corporativas: Soporte operativo a Microsoft 365, Teams, Outlook, OneDrive, Nimbo, Monday.com, Metabase/Estela, Odoo, sistemas administrativos Aspel y otras herramientas internas.</w:t>
-      </w:r>
-    </w:p>
-    <w:p>
-      <w:pPr>
-        <w:pStyle w:val="ListParagraph"/>
-        <w:numPr>
-          <w:ilvl w:val="0"/>
-          <w:numId w:val="2"/>
-        </w:numPr>
-        <w:spacing w:after="65"/>
-      </w:pPr>
-      <w:r>
-        <w:rPr>
-          <w:rFonts w:ascii="Calibri" w:cs="Calibri" w:eastAsia="Calibri" w:hAnsi="Calibri"/>
-          <w:color w:val="222222"/>
-          <w:sz w:val="19"/>
-          <w:szCs w:val="19"/>
-        </w:rPr>
-        <w:t xml:space="preserve">Diagnóstico y mantenimiento de equipos: Evaluación de fallas de hardware y software, reinstalación y recuperación de sistemas, gestión de controladores, respaldos, clonación de discos, configuración de periféricos y validaciones posteriores a mantenimiento.</w:t>
-      </w:r>
-    </w:p>
-    <w:p>
-      <w:pPr>
-        <w:pStyle w:val="ListParagraph"/>
-        <w:numPr>
-          <w:ilvl w:val="0"/>
-          <w:numId w:val="2"/>
-        </w:numPr>
-        <w:spacing w:after="65"/>
-      </w:pPr>
-      <w:r>
-        <w:rPr>
-          <w:rFonts w:ascii="Calibri" w:cs="Calibri" w:eastAsia="Calibri" w:hAnsi="Calibri"/>
-          <w:color w:val="222222"/>
-          <w:sz w:val="19"/>
-          <w:szCs w:val="19"/>
-        </w:rPr>
-        <w:t xml:space="preserve">Gestión documental y control de activos: Elaboración y seguimiento de responsivas, registros de asignación, evidencias fotográficas, reportes técnicos, documentación de incidencias y actualización de bases de datos de inventario y credenciales.</w:t>
-      </w:r>
-    </w:p>
-    <w:p>
-      <w:pPr>
-        <w:pStyle w:val="ListParagraph"/>
-        <w:numPr>
-          <w:ilvl w:val="0"/>
-          <w:numId w:val="2"/>
-        </w:numPr>
-        <w:spacing w:after="65"/>
-      </w:pPr>
-      <w:r>
-        <w:rPr>
-          <w:rFonts w:ascii="Calibri" w:cs="Calibri" w:eastAsia="Calibri" w:hAnsi="Calibri"/>
-          <w:color w:val="222222"/>
-          <w:sz w:val="19"/>
-          <w:szCs w:val="19"/>
-        </w:rPr>
-        <w:t xml:space="preserve">Seguimiento a proveedores y servicios tecnológicos: Coordinación de soporte con proveedores externos, seguimiento de garantías, adquisición o sustitución de componentes, líneas y dispositivos de telecomunicaciones y escalamiento de incidencias.</w:t>
-      </w:r>
-    </w:p>
-    <w:p>
-      <w:pPr>
-        <w:pStyle w:val="ListParagraph"/>
-        <w:numPr>
-          <w:ilvl w:val="0"/>
-          <w:numId w:val="2"/>
-        </w:numPr>
-        <w:spacing w:after="65"/>
-      </w:pPr>
-      <w:r>
-        <w:rPr>
-          <w:rFonts w:ascii="Calibri" w:cs="Calibri" w:eastAsia="Calibri" w:hAnsi="Calibri"/>
-          <w:color w:val="222222"/>
-          <w:sz w:val="19"/>
-          <w:szCs w:val="19"/>
-        </w:rPr>
-        <w:t xml:space="preserve">Análisis, seguimiento y mejora de procesos: Creación y mantenimiento de formularios, tableros, controles y reportes para seguimiento de incidencias, equipos, accesos y operación; identificación de discrepancias y riesgos relacionados con inventarios y cumplimiento de procesos.</w:t>
+        <w:t xml:space="preserve">Soporte técnico y gestión de incidencias: Atención, diagnóstico, seguimiento y resolución de incidencias de hardware, software, </w:t>
+      </w:r>
+      <w:r>
+        <w:rPr>
+          <w:rFonts w:ascii="Calibri" w:cs="Calibri" w:eastAsia="Calibri" w:hAnsi="Calibri"/>
+          <w:color w:val="222222"/>
+          <w:sz w:val="19"/>
+          <w:szCs w:val="19"/>
+          <w:b/>
+          <w:bCs/>
+        </w:rPr>
+        <w:t xml:space="preserve">Microsoft 365, conectividad</w:t>
+      </w:r>
+      <w:r>
+        <w:rPr>
+          <w:rFonts w:ascii="Calibri" w:cs="Calibri" w:eastAsia="Calibri" w:hAnsi="Calibri"/>
+          <w:color w:val="222222"/>
+          <w:sz w:val="19"/>
+          <w:szCs w:val="19"/>
+        </w:rPr>
+        <w:t xml:space="preserve">, periféricos y plataformas corporativas para </w:t>
+      </w:r>
+      <w:r>
+        <w:rPr>
+          <w:rFonts w:ascii="Calibri" w:cs="Calibri" w:eastAsia="Calibri" w:hAnsi="Calibri"/>
+          <w:color w:val="222222"/>
+          <w:sz w:val="19"/>
+          <w:szCs w:val="19"/>
+          <w:b/>
+          <w:bCs/>
+        </w:rPr>
+        <w:t xml:space="preserve">usuarios y sedes remotas</w:t>
+      </w:r>
+      <w:r>
+        <w:rPr>
+          <w:rFonts w:ascii="Calibri" w:cs="Calibri" w:eastAsia="Calibri" w:hAnsi="Calibri"/>
+          <w:color w:val="222222"/>
+          <w:sz w:val="19"/>
+          <w:szCs w:val="19"/>
+        </w:rPr>
+        <w:t xml:space="preserve">.</w:t>
+      </w:r>
+    </w:p>
+    <w:p>
+      <w:pPr>
+        <w:pStyle w:val="ListParagraph"/>
+        <w:numPr>
+          <w:ilvl w:val="0"/>
+          <w:numId w:val="2"/>
+        </w:numPr>
+        <w:spacing w:after="65"/>
+      </w:pPr>
+      <w:r>
+        <w:rPr>
+          <w:rFonts w:ascii="Calibri" w:cs="Calibri" w:eastAsia="Calibri" w:hAnsi="Calibri"/>
+          <w:color w:val="222222"/>
+          <w:sz w:val="19"/>
+          <w:szCs w:val="19"/>
+        </w:rPr>
+        <w:t xml:space="preserve">Administración de equipos e inventario tecnológico: Gestión del </w:t>
+      </w:r>
+      <w:r>
+        <w:rPr>
+          <w:rFonts w:ascii="Calibri" w:cs="Calibri" w:eastAsia="Calibri" w:hAnsi="Calibri"/>
+          <w:color w:val="222222"/>
+          <w:sz w:val="19"/>
+          <w:szCs w:val="19"/>
+          <w:b/>
+          <w:bCs/>
+        </w:rPr>
+        <w:t xml:space="preserve">ciclo de vida de equipos de cómputo y dispositivos móviles</w:t>
+      </w:r>
+      <w:r>
+        <w:rPr>
+          <w:rFonts w:ascii="Calibri" w:cs="Calibri" w:eastAsia="Calibri" w:hAnsi="Calibri"/>
+          <w:color w:val="222222"/>
+          <w:sz w:val="19"/>
+          <w:szCs w:val="19"/>
+        </w:rPr>
+        <w:t xml:space="preserve">, incluyendo asignaciones, altas, bajas, resguardos, inventarios, validación física y funcional, movimientos entre sedes y recuperación de activos.</w:t>
+      </w:r>
+    </w:p>
+    <w:p>
+      <w:pPr>
+        <w:pStyle w:val="ListParagraph"/>
+        <w:numPr>
+          <w:ilvl w:val="0"/>
+          <w:numId w:val="2"/>
+        </w:numPr>
+        <w:spacing w:after="65"/>
+      </w:pPr>
+      <w:r>
+        <w:rPr>
+          <w:rFonts w:ascii="Calibri" w:cs="Calibri" w:eastAsia="Calibri" w:hAnsi="Calibri"/>
+          <w:color w:val="222222"/>
+          <w:sz w:val="19"/>
+          <w:szCs w:val="19"/>
+        </w:rPr>
+        <w:t xml:space="preserve">Administración de usuarios, accesos y permisos: </w:t>
+      </w:r>
+      <w:r>
+        <w:rPr>
+          <w:rFonts w:ascii="Calibri" w:cs="Calibri" w:eastAsia="Calibri" w:hAnsi="Calibri"/>
+          <w:color w:val="222222"/>
+          <w:sz w:val="19"/>
+          <w:szCs w:val="19"/>
+          <w:b/>
+          <w:bCs/>
+        </w:rPr>
+        <w:t xml:space="preserve">Creación, modificación y baja de cuentas</w:t>
+      </w:r>
+      <w:r>
+        <w:rPr>
+          <w:rFonts w:ascii="Calibri" w:cs="Calibri" w:eastAsia="Calibri" w:hAnsi="Calibri"/>
+          <w:color w:val="222222"/>
+          <w:sz w:val="19"/>
+          <w:szCs w:val="19"/>
+        </w:rPr>
+        <w:t xml:space="preserve">; administración de permisos, credenciales, accesos a plataformas internas y soporte a procesos de </w:t>
+      </w:r>
+      <w:r>
+        <w:rPr>
+          <w:rFonts w:ascii="Calibri" w:cs="Calibri" w:eastAsia="Calibri" w:hAnsi="Calibri"/>
+          <w:color w:val="222222"/>
+          <w:sz w:val="19"/>
+          <w:szCs w:val="19"/>
+          <w:b/>
+          <w:bCs/>
+        </w:rPr>
+        <w:t xml:space="preserve">autenticación y recuperación de cuentas</w:t>
+      </w:r>
+      <w:r>
+        <w:rPr>
+          <w:rFonts w:ascii="Calibri" w:cs="Calibri" w:eastAsia="Calibri" w:hAnsi="Calibri"/>
+          <w:color w:val="222222"/>
+          <w:sz w:val="19"/>
+          <w:szCs w:val="19"/>
+        </w:rPr>
+        <w:t xml:space="preserve">.</w:t>
+      </w:r>
+    </w:p>
+    <w:p>
+      <w:pPr>
+        <w:pStyle w:val="ListParagraph"/>
+        <w:numPr>
+          <w:ilvl w:val="0"/>
+          <w:numId w:val="2"/>
+        </w:numPr>
+        <w:spacing w:after="65"/>
+      </w:pPr>
+      <w:r>
+        <w:rPr>
+          <w:rFonts w:ascii="Calibri" w:cs="Calibri" w:eastAsia="Calibri" w:hAnsi="Calibri"/>
+          <w:color w:val="222222"/>
+          <w:sz w:val="19"/>
+          <w:szCs w:val="19"/>
+        </w:rPr>
+        <w:t xml:space="preserve">Onboarding y offboarding tecnológico: Preparación y entrega de equipos, configuración de accesos y herramientas para </w:t>
+      </w:r>
+      <w:r>
+        <w:rPr>
+          <w:rFonts w:ascii="Calibri" w:cs="Calibri" w:eastAsia="Calibri" w:hAnsi="Calibri"/>
+          <w:color w:val="222222"/>
+          <w:sz w:val="19"/>
+          <w:szCs w:val="19"/>
+          <w:b/>
+          <w:bCs/>
+        </w:rPr>
+        <w:t xml:space="preserve">nuevos ingresos</w:t>
+      </w:r>
+      <w:r>
+        <w:rPr>
+          <w:rFonts w:ascii="Calibri" w:cs="Calibri" w:eastAsia="Calibri" w:hAnsi="Calibri"/>
+          <w:color w:val="222222"/>
+          <w:sz w:val="19"/>
+          <w:szCs w:val="19"/>
+        </w:rPr>
+        <w:t xml:space="preserve">, así como </w:t>
+      </w:r>
+      <w:r>
+        <w:rPr>
+          <w:rFonts w:ascii="Calibri" w:cs="Calibri" w:eastAsia="Calibri" w:hAnsi="Calibri"/>
+          <w:color w:val="222222"/>
+          <w:sz w:val="19"/>
+          <w:szCs w:val="19"/>
+          <w:b/>
+          <w:bCs/>
+        </w:rPr>
+        <w:t xml:space="preserve">revocación de accesos</w:t>
+      </w:r>
+      <w:r>
+        <w:rPr>
+          <w:rFonts w:ascii="Calibri" w:cs="Calibri" w:eastAsia="Calibri" w:hAnsi="Calibri"/>
+          <w:color w:val="222222"/>
+          <w:sz w:val="19"/>
+          <w:szCs w:val="19"/>
+        </w:rPr>
+        <w:t xml:space="preserve">, recuperación de activos y cierre tecnológico en procesos de baja.</w:t>
+      </w:r>
+    </w:p>
+    <w:p>
+      <w:pPr>
+        <w:pStyle w:val="ListParagraph"/>
+        <w:numPr>
+          <w:ilvl w:val="0"/>
+          <w:numId w:val="2"/>
+        </w:numPr>
+        <w:spacing w:after="65"/>
+      </w:pPr>
+      <w:r>
+        <w:rPr>
+          <w:rFonts w:ascii="Calibri" w:cs="Calibri" w:eastAsia="Calibri" w:hAnsi="Calibri"/>
+          <w:color w:val="222222"/>
+          <w:sz w:val="19"/>
+          <w:szCs w:val="19"/>
+        </w:rPr>
+        <w:t xml:space="preserve">Administración y soporte de plataformas corporativas: Soporte operativo a </w:t>
+      </w:r>
+      <w:r>
+        <w:rPr>
+          <w:rFonts w:ascii="Calibri" w:cs="Calibri" w:eastAsia="Calibri" w:hAnsi="Calibri"/>
+          <w:color w:val="222222"/>
+          <w:sz w:val="19"/>
+          <w:szCs w:val="19"/>
+          <w:b/>
+          <w:bCs/>
+        </w:rPr>
+        <w:t xml:space="preserve">Microsoft 365, Teams, Outlook, OneDrive</w:t>
+      </w:r>
+      <w:r>
+        <w:rPr>
+          <w:rFonts w:ascii="Calibri" w:cs="Calibri" w:eastAsia="Calibri" w:hAnsi="Calibri"/>
+          <w:color w:val="222222"/>
+          <w:sz w:val="19"/>
+          <w:szCs w:val="19"/>
+        </w:rPr>
+        <w:t xml:space="preserve">, Nimbo, Monday.com, Metabase/Estela, Odoo, sistemas administrativos Aspel y otras herramientas internas.</w:t>
+      </w:r>
+    </w:p>
+    <w:p>
+      <w:pPr>
+        <w:pStyle w:val="ListParagraph"/>
+        <w:numPr>
+          <w:ilvl w:val="0"/>
+          <w:numId w:val="2"/>
+        </w:numPr>
+        <w:spacing w:after="65"/>
+      </w:pPr>
+      <w:r>
+        <w:rPr>
+          <w:rFonts w:ascii="Calibri" w:cs="Calibri" w:eastAsia="Calibri" w:hAnsi="Calibri"/>
+          <w:color w:val="222222"/>
+          <w:sz w:val="19"/>
+          <w:szCs w:val="19"/>
+        </w:rPr>
+        <w:t xml:space="preserve">Diagnóstico y mantenimiento de equipos: Evaluación de fallas de hardware y software, </w:t>
+      </w:r>
+      <w:r>
+        <w:rPr>
+          <w:rFonts w:ascii="Calibri" w:cs="Calibri" w:eastAsia="Calibri" w:hAnsi="Calibri"/>
+          <w:color w:val="222222"/>
+          <w:sz w:val="19"/>
+          <w:szCs w:val="19"/>
+          <w:b/>
+          <w:bCs/>
+        </w:rPr>
+        <w:t xml:space="preserve">reinstalación y recuperación de sistemas</w:t>
+      </w:r>
+      <w:r>
+        <w:rPr>
+          <w:rFonts w:ascii="Calibri" w:cs="Calibri" w:eastAsia="Calibri" w:hAnsi="Calibri"/>
+          <w:color w:val="222222"/>
+          <w:sz w:val="19"/>
+          <w:szCs w:val="19"/>
+        </w:rPr>
+        <w:t xml:space="preserve">, gestión de controladores, </w:t>
+      </w:r>
+      <w:r>
+        <w:rPr>
+          <w:rFonts w:ascii="Calibri" w:cs="Calibri" w:eastAsia="Calibri" w:hAnsi="Calibri"/>
+          <w:color w:val="222222"/>
+          <w:sz w:val="19"/>
+          <w:szCs w:val="19"/>
+          <w:b/>
+          <w:bCs/>
+        </w:rPr>
+        <w:t xml:space="preserve">respaldos, clonación de discos</w:t>
+      </w:r>
+      <w:r>
+        <w:rPr>
+          <w:rFonts w:ascii="Calibri" w:cs="Calibri" w:eastAsia="Calibri" w:hAnsi="Calibri"/>
+          <w:color w:val="222222"/>
+          <w:sz w:val="19"/>
+          <w:szCs w:val="19"/>
+        </w:rPr>
+        <w:t xml:space="preserve">, configuración de periféricos y validaciones posteriores a mantenimiento.</w:t>
+      </w:r>
+    </w:p>
+    <w:p>
+      <w:pPr>
+        <w:pStyle w:val="ListParagraph"/>
+        <w:numPr>
+          <w:ilvl w:val="0"/>
+          <w:numId w:val="2"/>
+        </w:numPr>
+        <w:spacing w:after="65"/>
+      </w:pPr>
+      <w:r>
+        <w:rPr>
+          <w:rFonts w:ascii="Calibri" w:cs="Calibri" w:eastAsia="Calibri" w:hAnsi="Calibri"/>
+          <w:color w:val="222222"/>
+          <w:sz w:val="19"/>
+          <w:szCs w:val="19"/>
+        </w:rPr>
+        <w:t xml:space="preserve">Gestión documental y control de activos: Elaboración y seguimiento de responsivas, registros de asignación, evidencias fotográficas, </w:t>
+      </w:r>
+      <w:r>
+        <w:rPr>
+          <w:rFonts w:ascii="Calibri" w:cs="Calibri" w:eastAsia="Calibri" w:hAnsi="Calibri"/>
+          <w:color w:val="222222"/>
+          <w:sz w:val="19"/>
+          <w:szCs w:val="19"/>
+          <w:b/>
+          <w:bCs/>
+        </w:rPr>
+        <w:t xml:space="preserve">reportes técnicos, documentación de incidencias</w:t>
+      </w:r>
+      <w:r>
+        <w:rPr>
+          <w:rFonts w:ascii="Calibri" w:cs="Calibri" w:eastAsia="Calibri" w:hAnsi="Calibri"/>
+          <w:color w:val="222222"/>
+          <w:sz w:val="19"/>
+          <w:szCs w:val="19"/>
+        </w:rPr>
+        <w:t xml:space="preserve"> y actualización de bases de datos de inventario y credenciales.</w:t>
+      </w:r>
+    </w:p>
+    <w:p>
+      <w:pPr>
+        <w:pStyle w:val="ListParagraph"/>
+        <w:numPr>
+          <w:ilvl w:val="0"/>
+          <w:numId w:val="2"/>
+        </w:numPr>
+        <w:spacing w:after="65"/>
+      </w:pPr>
+      <w:r>
+        <w:rPr>
+          <w:rFonts w:ascii="Calibri" w:cs="Calibri" w:eastAsia="Calibri" w:hAnsi="Calibri"/>
+          <w:color w:val="222222"/>
+          <w:sz w:val="19"/>
+          <w:szCs w:val="19"/>
+        </w:rPr>
+        <w:t xml:space="preserve">Seguimiento a proveedores y servicios tecnológicos: Coordinación de soporte con </w:t>
+      </w:r>
+      <w:r>
+        <w:rPr>
+          <w:rFonts w:ascii="Calibri" w:cs="Calibri" w:eastAsia="Calibri" w:hAnsi="Calibri"/>
+          <w:color w:val="222222"/>
+          <w:sz w:val="19"/>
+          <w:szCs w:val="19"/>
+          <w:b/>
+          <w:bCs/>
+        </w:rPr>
+        <w:t xml:space="preserve">proveedores externos</w:t>
+      </w:r>
+      <w:r>
+        <w:rPr>
+          <w:rFonts w:ascii="Calibri" w:cs="Calibri" w:eastAsia="Calibri" w:hAnsi="Calibri"/>
+          <w:color w:val="222222"/>
+          <w:sz w:val="19"/>
+          <w:szCs w:val="19"/>
+        </w:rPr>
+        <w:t xml:space="preserve">, seguimiento de garantías, adquisición o sustitución de componentes, líneas y dispositivos de telecomunicaciones y </w:t>
+      </w:r>
+      <w:r>
+        <w:rPr>
+          <w:rFonts w:ascii="Calibri" w:cs="Calibri" w:eastAsia="Calibri" w:hAnsi="Calibri"/>
+          <w:color w:val="222222"/>
+          <w:sz w:val="19"/>
+          <w:szCs w:val="19"/>
+          <w:b/>
+          <w:bCs/>
+        </w:rPr>
+        <w:t xml:space="preserve">escalamiento de incidencias</w:t>
+      </w:r>
+      <w:r>
+        <w:rPr>
+          <w:rFonts w:ascii="Calibri" w:cs="Calibri" w:eastAsia="Calibri" w:hAnsi="Calibri"/>
+          <w:color w:val="222222"/>
+          <w:sz w:val="19"/>
+          <w:szCs w:val="19"/>
+        </w:rPr>
+        <w:t xml:space="preserve">.</w:t>
+      </w:r>
+    </w:p>
+    <w:p>
+      <w:pPr>
+        <w:pStyle w:val="ListParagraph"/>
+        <w:numPr>
+          <w:ilvl w:val="0"/>
+          <w:numId w:val="2"/>
+        </w:numPr>
+        <w:spacing w:after="65"/>
+      </w:pPr>
+      <w:r>
+        <w:rPr>
+          <w:rFonts w:ascii="Calibri" w:cs="Calibri" w:eastAsia="Calibri" w:hAnsi="Calibri"/>
+          <w:color w:val="222222"/>
+          <w:sz w:val="19"/>
+          <w:szCs w:val="19"/>
+        </w:rPr>
+        <w:t xml:space="preserve">Análisis, seguimiento y mejora de procesos: Creación y mantenimiento de </w:t>
+      </w:r>
+      <w:r>
+        <w:rPr>
+          <w:rFonts w:ascii="Calibri" w:cs="Calibri" w:eastAsia="Calibri" w:hAnsi="Calibri"/>
+          <w:color w:val="222222"/>
+          <w:sz w:val="19"/>
+          <w:szCs w:val="19"/>
+          <w:b/>
+          <w:bCs/>
+        </w:rPr>
+        <w:t xml:space="preserve">formularios, tableros, controles y reportes</w:t>
+      </w:r>
+      <w:r>
+        <w:rPr>
+          <w:rFonts w:ascii="Calibri" w:cs="Calibri" w:eastAsia="Calibri" w:hAnsi="Calibri"/>
+          <w:color w:val="222222"/>
+          <w:sz w:val="19"/>
+          <w:szCs w:val="19"/>
+        </w:rPr>
+        <w:t xml:space="preserve"> para seguimiento de incidencias, equipos, accesos y operación; identificación de discrepancias y riesgos relacionados con inventarios y cumplimiento de procesos.</w:t>
       </w:r>
     </w:p>
     <w:p>
@@ -412,45 +756,105 @@
           <w:sz w:val="19"/>
           <w:szCs w:val="19"/>
         </w:rPr>
-        <w:t xml:space="preserve">Gestión y análisis de solicitudes de crédito hipotecario, validando información personal, financiera y documental para procesos de precalificación y aprobación.</w:t>
-      </w:r>
-    </w:p>
-    <w:p>
-      <w:pPr>
-        <w:pStyle w:val="ListParagraph"/>
-        <w:numPr>
-          <w:ilvl w:val="0"/>
-          <w:numId w:val="2"/>
-        </w:numPr>
-        <w:spacing w:after="65"/>
-      </w:pPr>
-      <w:r>
-        <w:rPr>
-          <w:rFonts w:ascii="Calibri" w:cs="Calibri" w:eastAsia="Calibri" w:hAnsi="Calibri"/>
-          <w:color w:val="222222"/>
-          <w:sz w:val="19"/>
-          <w:szCs w:val="19"/>
-        </w:rPr>
-        <w:t xml:space="preserve">Análisis de expedientes conforme a políticas bancarias y gestión de casos en plataformas de Scotiabank, Banamex, HSBC, Banorte y Santander.</w:t>
-      </w:r>
-    </w:p>
-    <w:p>
-      <w:pPr>
-        <w:pStyle w:val="ListParagraph"/>
-        <w:numPr>
-          <w:ilvl w:val="0"/>
-          <w:numId w:val="2"/>
-        </w:numPr>
-        <w:spacing w:after="65"/>
-      </w:pPr>
-      <w:r>
-        <w:rPr>
-          <w:rFonts w:ascii="Calibri" w:cs="Calibri" w:eastAsia="Calibri" w:hAnsi="Calibri"/>
-          <w:color w:val="222222"/>
-          <w:sz w:val="19"/>
-          <w:szCs w:val="19"/>
-        </w:rPr>
-        <w:t xml:space="preserve">Seguimiento de precalificación, aprobación y avalúo; integración documental, carga de expedientes y atención de observaciones de mesas de control.</w:t>
+        <w:t xml:space="preserve">Gestión y análisis de solicitudes de crédito hipotecario, validando </w:t>
+      </w:r>
+      <w:r>
+        <w:rPr>
+          <w:rFonts w:ascii="Calibri" w:cs="Calibri" w:eastAsia="Calibri" w:hAnsi="Calibri"/>
+          <w:color w:val="222222"/>
+          <w:sz w:val="19"/>
+          <w:szCs w:val="19"/>
+          <w:b/>
+          <w:bCs/>
+        </w:rPr>
+        <w:t xml:space="preserve">información personal, financiera y documental</w:t>
+      </w:r>
+      <w:r>
+        <w:rPr>
+          <w:rFonts w:ascii="Calibri" w:cs="Calibri" w:eastAsia="Calibri" w:hAnsi="Calibri"/>
+          <w:color w:val="222222"/>
+          <w:sz w:val="19"/>
+          <w:szCs w:val="19"/>
+        </w:rPr>
+        <w:t xml:space="preserve"> para procesos de precalificación y aprobación.</w:t>
+      </w:r>
+    </w:p>
+    <w:p>
+      <w:pPr>
+        <w:pStyle w:val="ListParagraph"/>
+        <w:numPr>
+          <w:ilvl w:val="0"/>
+          <w:numId w:val="2"/>
+        </w:numPr>
+        <w:spacing w:after="65"/>
+      </w:pPr>
+      <w:r>
+        <w:rPr>
+          <w:rFonts w:ascii="Calibri" w:cs="Calibri" w:eastAsia="Calibri" w:hAnsi="Calibri"/>
+          <w:color w:val="222222"/>
+          <w:sz w:val="19"/>
+          <w:szCs w:val="19"/>
+        </w:rPr>
+        <w:t xml:space="preserve">Análisis de expedientes conforme a políticas bancarias y gestión de casos en plataformas de </w:t>
+      </w:r>
+      <w:r>
+        <w:rPr>
+          <w:rFonts w:ascii="Calibri" w:cs="Calibri" w:eastAsia="Calibri" w:hAnsi="Calibri"/>
+          <w:color w:val="222222"/>
+          <w:sz w:val="19"/>
+          <w:szCs w:val="19"/>
+          <w:b/>
+          <w:bCs/>
+        </w:rPr>
+        <w:t xml:space="preserve">Scotiabank, Banamex, HSBC, Banorte y Santander</w:t>
+      </w:r>
+      <w:r>
+        <w:rPr>
+          <w:rFonts w:ascii="Calibri" w:cs="Calibri" w:eastAsia="Calibri" w:hAnsi="Calibri"/>
+          <w:color w:val="222222"/>
+          <w:sz w:val="19"/>
+          <w:szCs w:val="19"/>
+        </w:rPr>
+        <w:t xml:space="preserve">.</w:t>
+      </w:r>
+    </w:p>
+    <w:p>
+      <w:pPr>
+        <w:pStyle w:val="ListParagraph"/>
+        <w:numPr>
+          <w:ilvl w:val="0"/>
+          <w:numId w:val="2"/>
+        </w:numPr>
+        <w:spacing w:after="65"/>
+      </w:pPr>
+      <w:r>
+        <w:rPr>
+          <w:rFonts w:ascii="Calibri" w:cs="Calibri" w:eastAsia="Calibri" w:hAnsi="Calibri"/>
+          <w:color w:val="222222"/>
+          <w:sz w:val="19"/>
+          <w:szCs w:val="19"/>
+        </w:rPr>
+        <w:t xml:space="preserve">Seguimiento de precalificación, aprobación y avalúo; integración documental, carga de expedientes y atención de observaciones de </w:t>
+      </w:r>
+      <w:r>
+        <w:rPr>
+          <w:rFonts w:ascii="Calibri" w:cs="Calibri" w:eastAsia="Calibri" w:hAnsi="Calibri"/>
+          <w:color w:val="222222"/>
+          <w:sz w:val="19"/>
+          <w:szCs w:val="19"/>
+          <w:b/>
+          <w:bCs/>
+        </w:rPr>
+        <w:t xml:space="preserve">mesas de control</w:t>
+      </w:r>
+      <w:r>
+        <w:rPr>
+          <w:rFonts w:ascii="Calibri" w:cs="Calibri" w:eastAsia="Calibri" w:hAnsi="Calibri"/>
+          <w:color w:val="222222"/>
+          <w:sz w:val="19"/>
+          <w:szCs w:val="19"/>
+        </w:rPr>
+        <w:t xml:space="preserve">.</w:t>
       </w:r>
     </w:p>
     <w:p>
@@ -488,7 +892,27 @@
           <w:sz w:val="19"/>
           <w:szCs w:val="19"/>
         </w:rPr>
-        <w:t xml:space="preserve">Creación y administración de una base de seguimiento de más de 2,000 registros, controlando folios, banco, estatus, documentación y resultados; comunicación continua con brokers hipotecarios.</w:t>
+        <w:t xml:space="preserve">Creación y administración de una base de seguimiento de </w:t>
+      </w:r>
+      <w:r>
+        <w:rPr>
+          <w:rFonts w:ascii="Calibri" w:cs="Calibri" w:eastAsia="Calibri" w:hAnsi="Calibri"/>
+          <w:color w:val="222222"/>
+          <w:sz w:val="19"/>
+          <w:szCs w:val="19"/>
+          <w:b/>
+          <w:bCs/>
+        </w:rPr>
+        <w:t xml:space="preserve">más de 2,000 registros</w:t>
+      </w:r>
+      <w:r>
+        <w:rPr>
+          <w:rFonts w:ascii="Calibri" w:cs="Calibri" w:eastAsia="Calibri" w:hAnsi="Calibri"/>
+          <w:color w:val="222222"/>
+          <w:sz w:val="19"/>
+          <w:szCs w:val="19"/>
+        </w:rPr>
+        <w:t xml:space="preserve">, controlando folios, banco, estatus, documentación y resultados; comunicación continua con brokers hipotecarios.</w:t>
       </w:r>
     </w:p>
     <w:p>

</xml_diff>